<commit_message>
Added More Context docs
</commit_message>
<xml_diff>
--- a/docs/QE_Protocols_POCs.docx
+++ b/docs/QE_Protocols_POCs.docx
@@ -73,7 +73,7 @@
     </w:p>
     <w:p>
       <w:pPr>
-        <w:ind w:left="720" w:first-line="-720"/>
+        <w:ind w:left="720"/>
         <w:spacing w:after="240"/>
       </w:pPr>
       <w:r>
@@ -129,7 +129,7 @@
     </w:p>
     <w:p>
       <w:pPr>
-        <w:ind w:left="720" w:first-line="-720"/>
+        <w:ind w:left="720"/>
         <w:spacing w:after="240"/>
       </w:pPr>
       <w:r>
@@ -185,7 +185,7 @@
     </w:p>
     <w:p>
       <w:pPr>
-        <w:ind w:left="720" w:first-line="-720"/>
+        <w:ind w:left="720"/>
         <w:spacing w:after="240"/>
       </w:pPr>
       <w:r>
@@ -259,7 +259,7 @@
     </w:p>
     <w:p>
       <w:pPr>
-        <w:ind w:left="720" w:first-line="-720"/>
+        <w:ind w:left="720"/>
       </w:pPr>
       <w:r>
         <w:rPr>
@@ -321,7 +321,7 @@
     </w:p>
     <w:p>
       <w:pPr>
-        <w:ind w:left="720" w:first-line="-720"/>
+        <w:ind w:left="720"/>
         <w:spacing w:after="240"/>
       </w:pPr>
       <w:r>
@@ -377,7 +377,7 @@
     </w:p>
     <w:p>
       <w:pPr>
-        <w:ind w:left="720" w:first-line="-720"/>
+        <w:ind w:left="720"/>
         <w:spacing w:after="240"/>
       </w:pPr>
       <w:r>
@@ -433,7 +433,7 @@
     </w:p>
     <w:p>
       <w:pPr>
-        <w:ind w:left="720" w:first-line="-720"/>
+        <w:ind w:left="720"/>
         <w:spacing w:after="240"/>
       </w:pPr>
       <w:r>
@@ -489,7 +489,7 @@
     </w:p>
     <w:p>
       <w:pPr>
-        <w:ind w:left="720" w:first-line="-720"/>
+        <w:ind w:left="720"/>
       </w:pPr>
       <w:r>
         <w:rPr>
@@ -551,7 +551,7 @@
     </w:p>
     <w:p>
       <w:pPr>
-        <w:ind w:left="720" w:first-line="-720"/>
+        <w:ind w:left="720"/>
         <w:spacing w:after="240"/>
       </w:pPr>
       <w:r>
@@ -607,7 +607,7 @@
     </w:p>
     <w:p>
       <w:pPr>
-        <w:ind w:left="720" w:first-line="-720"/>
+        <w:ind w:left="720"/>
         <w:spacing w:after="240"/>
       </w:pPr>
       <w:r>
@@ -663,7 +663,7 @@
     </w:p>
     <w:p>
       <w:pPr>
-        <w:ind w:left="720" w:first-line="-720"/>
+        <w:ind w:left="720"/>
         <w:spacing w:after="240"/>
       </w:pPr>
       <w:r>
@@ -719,7 +719,7 @@
     </w:p>
     <w:p>
       <w:pPr>
-        <w:ind w:left="720" w:first-line="-720"/>
+        <w:ind w:left="720"/>
       </w:pPr>
       <w:r>
         <w:rPr>
@@ -781,7 +781,7 @@
     </w:p>
     <w:p>
       <w:pPr>
-        <w:ind w:left="720" w:first-line="-720"/>
+        <w:ind w:left="720"/>
         <w:spacing w:after="240"/>
       </w:pPr>
       <w:r>
@@ -837,7 +837,7 @@
     </w:p>
     <w:p>
       <w:pPr>
-        <w:ind w:left="720" w:first-line="-720"/>
+        <w:ind w:left="720"/>
         <w:spacing w:after="240"/>
       </w:pPr>
       <w:r>
@@ -893,7 +893,7 @@
     </w:p>
     <w:p>
       <w:pPr>
-        <w:ind w:left="720" w:first-line="-720"/>
+        <w:ind w:left="720"/>
         <w:spacing w:after="240"/>
       </w:pPr>
       <w:r>
@@ -949,7 +949,7 @@
     </w:p>
     <w:p>
       <w:pPr>
-        <w:ind w:left="720" w:first-line="-720"/>
+        <w:ind w:left="720"/>
       </w:pPr>
       <w:r>
         <w:rPr>
@@ -1665,7 +1665,7 @@
     </w:p>
     <w:p>
       <w:pPr>
-        <w:ind w:left="720" w:first-line="-720"/>
+        <w:ind w:left="720"/>
         <w:spacing w:after="240"/>
       </w:pPr>
       <w:r>
@@ -1703,7 +1703,7 @@
     </w:p>
     <w:p>
       <w:pPr>
-        <w:ind w:left="720" w:first-line="-720"/>
+        <w:ind w:left="720"/>
         <w:spacing w:after="240"/>
       </w:pPr>
       <w:r>
@@ -1759,7 +1759,7 @@
     </w:p>
     <w:p>
       <w:pPr>
-        <w:ind w:left="720" w:first-line="-720"/>
+        <w:ind w:left="720"/>
         <w:spacing w:after="240"/>
       </w:pPr>
       <w:r>
@@ -1816,7 +1816,7 @@
     </w:p>
     <w:p>
       <w:pPr>
-        <w:ind w:left="720" w:first-line="-720"/>
+        <w:ind w:left="720"/>
       </w:pPr>
       <w:r>
         <w:rPr>
@@ -3039,94 +3039,221 @@
     </w:p>
     <w:p>
       <w:pPr>
+        <w:ind w:left="720"/>
+        <w:spacing w:after="240"/>
+      </w:pPr>
+      <w:r>
+        <w:rPr>
+          <w:rFonts w:ascii="Helvetica Neue" w:hAnsi="Helvetica Neue" w:cs="Helvetica Neue"/>
+          <w:sz w:val="32"/>
+          <w:sz-cs w:val="32"/>
+          <w:b/>
+        </w:rPr>
+        <w:t xml:space="preserve"/>
+        <w:tab/>
+        <w:t xml:space="preserve">•</w:t>
+        <w:tab/>
+        <w:t xml:space="preserve"/>
+      </w:r>
+      <w:r>
+        <w:rPr>
+          <w:rFonts w:ascii="Helvetica Neue" w:hAnsi="Helvetica Neue" w:cs="Helvetica Neue"/>
+          <w:sz w:val="32"/>
+          <w:sz-cs w:val="32"/>
+          <w:b/>
+          <w:spacing w:val="0"/>
+        </w:rPr>
+        <w:t xml:space="preserve">Payment Gateway (Stripe Sandbox):</w:t>
+      </w:r>
+      <w:r>
+        <w:rPr>
+          <w:rFonts w:ascii="Helvetica Neue" w:hAnsi="Helvetica Neue" w:cs="Helvetica Neue"/>
+          <w:sz w:val="32"/>
+          <w:sz-cs w:val="32"/>
+          <w:spacing w:val="0"/>
+        </w:rPr>
+        <w:t xml:space="preserve"> Use test card </w:t>
+      </w:r>
+      <w:r>
+        <w:rPr>
+          <w:rFonts w:ascii="Courier" w:hAnsi="Courier" w:cs="Courier"/>
+          <w:sz w:val="28"/>
+          <w:sz-cs w:val="28"/>
+          <w:spacing w:val="0"/>
+        </w:rPr>
+        <w:t xml:space="preserve">4242 4242 4242 4242</w:t>
+      </w:r>
+      <w:r>
+        <w:rPr>
+          <w:rFonts w:ascii="Helvetica Neue" w:hAnsi="Helvetica Neue" w:cs="Helvetica Neue"/>
+          <w:sz w:val="32"/>
+          <w:sz-cs w:val="32"/>
+          <w:spacing w:val="0"/>
+        </w:rPr>
+        <w:t xml:space="preserve"> (Exp: </w:t>
+      </w:r>
+      <w:r>
+        <w:rPr>
+          <w:rFonts w:ascii="Courier" w:hAnsi="Courier" w:cs="Courier"/>
+          <w:sz w:val="28"/>
+          <w:sz-cs w:val="28"/>
+          <w:spacing w:val="0"/>
+        </w:rPr>
+        <w:t xml:space="preserve">12/28</w:t>
+      </w:r>
+      <w:r>
+        <w:rPr>
+          <w:rFonts w:ascii="Helvetica Neue" w:hAnsi="Helvetica Neue" w:cs="Helvetica Neue"/>
+          <w:sz w:val="32"/>
+          <w:sz-cs w:val="32"/>
+          <w:spacing w:val="0"/>
+        </w:rPr>
+        <w:t xml:space="preserve">, CVC: </w:t>
+      </w:r>
+      <w:r>
+        <w:rPr>
+          <w:rFonts w:ascii="Courier" w:hAnsi="Courier" w:cs="Courier"/>
+          <w:sz w:val="28"/>
+          <w:sz-cs w:val="28"/>
+          <w:spacing w:val="0"/>
+        </w:rPr>
+        <w:t xml:space="preserve">123</w:t>
+      </w:r>
+      <w:r>
+        <w:rPr>
+          <w:rFonts w:ascii="Helvetica Neue" w:hAnsi="Helvetica Neue" w:cs="Helvetica Neue"/>
+          <w:sz w:val="32"/>
+          <w:sz-cs w:val="32"/>
+          <w:spacing w:val="0"/>
+        </w:rPr>
+        <w:t xml:space="preserve">)</w:t>
+      </w:r>
+    </w:p>
+    <w:p>
+      <w:pPr>
+        <w:ind w:left="720"/>
+      </w:pPr>
+      <w:r>
+        <w:rPr>
+          <w:rFonts w:ascii="Helvetica Neue" w:hAnsi="Helvetica Neue" w:cs="Helvetica Neue"/>
+          <w:sz w:val="32"/>
+          <w:sz-cs w:val="32"/>
+          <w:b/>
+        </w:rPr>
+        <w:t xml:space="preserve"/>
+        <w:tab/>
+        <w:t xml:space="preserve">•</w:t>
+        <w:tab/>
+        <w:t xml:space="preserve"/>
+      </w:r>
+      <w:r>
+        <w:rPr>
+          <w:rFonts w:ascii="Helvetica Neue" w:hAnsi="Helvetica Neue" w:cs="Helvetica Neue"/>
+          <w:sz w:val="32"/>
+          <w:sz-cs w:val="32"/>
+          <w:b/>
+          <w:spacing w:val="0"/>
+        </w:rPr>
+        <w:t xml:space="preserve">Email Service (Mailtrap):</w:t>
+      </w:r>
+      <w:r>
+        <w:rPr>
+          <w:rFonts w:ascii="Helvetica Neue" w:hAnsi="Helvetica Neue" w:cs="Helvetica Neue"/>
+          <w:sz w:val="32"/>
+          <w:sz-cs w:val="32"/>
+          <w:spacing w:val="0"/>
+        </w:rPr>
+        <w:t xml:space="preserve"> View outgoing test emails at </w:t>
+      </w:r>
+      <w:r>
+        <w:rPr>
+          <w:rFonts w:ascii="Courier" w:hAnsi="Courier" w:cs="Courier"/>
+          <w:sz w:val="28"/>
+          <w:sz-cs w:val="28"/>
+          <w:spacing w:val="0"/>
+        </w:rPr>
+        <w:t xml:space="preserve">https://app-domain.com</w:t>
+      </w:r>
+    </w:p>
+    <w:p>
+      <w:pPr>
+        <w:ind w:left="720"/>
+      </w:pPr>
+      <w:r>
+        <w:rPr>
+          <w:rFonts w:ascii="Courier" w:hAnsi="Courier" w:cs="Courier"/>
+          <w:sz w:val="28"/>
+          <w:sz-cs w:val="28"/>
+          <w:spacing w:val="0"/>
+        </w:rPr>
+        <w:t xml:space="preserve"/>
+      </w:r>
+    </w:p>
+    <w:p>
+      <w:pPr/>
+      <w:r>
+        <w:rPr>
+          <w:rFonts w:ascii="Helvetica Neue" w:hAnsi="Helvetica Neue" w:cs="Helvetica Neue"/>
+          <w:sz w:val="80"/>
+          <w:sz-cs w:val="80"/>
+          <w:spacing w:val="0"/>
+          <w:color w:val="161618"/>
+        </w:rPr>
+        <w:t xml:space="preserve">Test Cards for Apps and the Web</w:t>
+      </w:r>
+    </w:p>
+    <w:p>
+      <w:pPr/>
+      <w:r>
+        <w:rPr>
+          <w:rFonts w:ascii="Helvetica Neue" w:hAnsi="Helvetica Neue" w:cs="Helvetica Neue"/>
+          <w:sz w:val="34"/>
+          <w:sz-cs w:val="34"/>
+          <w:spacing w:val="0"/>
+          <w:color w:val="161618"/>
+        </w:rPr>
+        <w:t xml:space="preserve">Test card numbers (FPAN, CVV, CVC, Expiration Date) from the payment networks are listed below and can be used on supported devices to test within the Apple Pay sandbox environment.</w:t>
+      </w:r>
+    </w:p>
+    <w:p>
+      <w:pPr/>
+      <w:r>
+        <w:rPr>
+          <w:rFonts w:ascii="Helvetica Neue" w:hAnsi="Helvetica Neue" w:cs="Helvetica Neue"/>
+          <w:sz w:val="34"/>
+          <w:sz-cs w:val="34"/>
+          <w:spacing w:val="0"/>
+          <w:color w:val="161618"/>
+        </w:rPr>
+        <w:t xml:space="preserve">Note:</w:t>
+      </w:r>
+    </w:p>
+    <w:p>
+      <w:pPr>
         <w:ind w:left="720" w:first-line="-720"/>
-        <w:spacing w:after="240"/>
-      </w:pPr>
-      <w:r>
-        <w:rPr>
-          <w:rFonts w:ascii="Helvetica Neue" w:hAnsi="Helvetica Neue" w:cs="Helvetica Neue"/>
-          <w:sz w:val="32"/>
-          <w:sz-cs w:val="32"/>
-          <w:b/>
-        </w:rPr>
-        <w:t xml:space="preserve"/>
-        <w:tab/>
-        <w:t xml:space="preserve">•</w:t>
-        <w:tab/>
-        <w:t xml:space="preserve"/>
-      </w:r>
-      <w:r>
-        <w:rPr>
-          <w:rFonts w:ascii="Helvetica Neue" w:hAnsi="Helvetica Neue" w:cs="Helvetica Neue"/>
-          <w:sz w:val="32"/>
-          <w:sz-cs w:val="32"/>
-          <w:b/>
-          <w:spacing w:val="0"/>
-        </w:rPr>
-        <w:t xml:space="preserve">Payment Gateway (Stripe Sandbox):</w:t>
-      </w:r>
-      <w:r>
-        <w:rPr>
-          <w:rFonts w:ascii="Helvetica Neue" w:hAnsi="Helvetica Neue" w:cs="Helvetica Neue"/>
-          <w:sz w:val="32"/>
-          <w:sz-cs w:val="32"/>
-          <w:spacing w:val="0"/>
-        </w:rPr>
-        <w:t xml:space="preserve"> Use test card </w:t>
-      </w:r>
-      <w:r>
-        <w:rPr>
-          <w:rFonts w:ascii="Courier" w:hAnsi="Courier" w:cs="Courier"/>
-          <w:sz w:val="28"/>
-          <w:sz-cs w:val="28"/>
-          <w:spacing w:val="0"/>
-        </w:rPr>
-        <w:t xml:space="preserve">4242 4242 4242 4242</w:t>
-      </w:r>
-      <w:r>
-        <w:rPr>
-          <w:rFonts w:ascii="Helvetica Neue" w:hAnsi="Helvetica Neue" w:cs="Helvetica Neue"/>
-          <w:sz w:val="32"/>
-          <w:sz-cs w:val="32"/>
-          <w:spacing w:val="0"/>
-        </w:rPr>
-        <w:t xml:space="preserve"> (Exp: </w:t>
-      </w:r>
-      <w:r>
-        <w:rPr>
-          <w:rFonts w:ascii="Courier" w:hAnsi="Courier" w:cs="Courier"/>
-          <w:sz w:val="28"/>
-          <w:sz-cs w:val="28"/>
-          <w:spacing w:val="0"/>
-        </w:rPr>
-        <w:t xml:space="preserve">12/28</w:t>
-      </w:r>
-      <w:r>
-        <w:rPr>
-          <w:rFonts w:ascii="Helvetica Neue" w:hAnsi="Helvetica Neue" w:cs="Helvetica Neue"/>
-          <w:sz w:val="32"/>
-          <w:sz-cs w:val="32"/>
-          <w:spacing w:val="0"/>
-        </w:rPr>
-        <w:t xml:space="preserve">, CVC: </w:t>
-      </w:r>
-      <w:r>
-        <w:rPr>
-          <w:rFonts w:ascii="Courier" w:hAnsi="Courier" w:cs="Courier"/>
-          <w:sz w:val="28"/>
-          <w:sz-cs w:val="28"/>
-          <w:spacing w:val="0"/>
-        </w:rPr>
-        <w:t xml:space="preserve">123</w:t>
-      </w:r>
-      <w:r>
-        <w:rPr>
-          <w:rFonts w:ascii="Helvetica Neue" w:hAnsi="Helvetica Neue" w:cs="Helvetica Neue"/>
-          <w:sz w:val="32"/>
-          <w:sz-cs w:val="32"/>
-          <w:spacing w:val="0"/>
-        </w:rPr>
-        <w:t xml:space="preserve">)</w:t>
+      </w:pPr>
+      <w:r>
+        <w:rPr>
+          <w:rFonts w:ascii="Helvetica Neue" w:hAnsi="Helvetica Neue" w:cs="Helvetica Neue"/>
+          <w:sz w:val="34"/>
+          <w:sz-cs w:val="34"/>
+          <w:color w:val="161618"/>
+        </w:rPr>
+        <w:t xml:space="preserve"/>
+        <w:tab/>
+        <w:t xml:space="preserve">•</w:t>
+        <w:tab/>
+        <w:t xml:space="preserve"/>
+      </w:r>
+      <w:r>
+        <w:rPr>
+          <w:rFonts w:ascii="Helvetica Neue" w:hAnsi="Helvetica Neue" w:cs="Helvetica Neue"/>
+          <w:sz w:val="34"/>
+          <w:sz-cs w:val="34"/>
+          <w:spacing w:val="0"/>
+          <w:color w:val="161618"/>
+        </w:rPr>
+        <w:t xml:space="preserve">FPAN and DPAN expiration dates do not need to match.</w:t>
       </w:r>
     </w:p>
     <w:p>
@@ -3136,44 +3263,1602 @@
       <w:r>
         <w:rPr>
           <w:rFonts w:ascii="Helvetica Neue" w:hAnsi="Helvetica Neue" w:cs="Helvetica Neue"/>
-          <w:sz w:val="32"/>
-          <w:sz-cs w:val="32"/>
-          <w:b/>
-        </w:rPr>
-        <w:t xml:space="preserve"/>
-        <w:tab/>
-        <w:t xml:space="preserve">•</w:t>
-        <w:tab/>
-        <w:t xml:space="preserve"/>
-      </w:r>
-      <w:r>
-        <w:rPr>
-          <w:rFonts w:ascii="Helvetica Neue" w:hAnsi="Helvetica Neue" w:cs="Helvetica Neue"/>
-          <w:sz w:val="32"/>
-          <w:sz-cs w:val="32"/>
-          <w:b/>
-          <w:spacing w:val="0"/>
-        </w:rPr>
-        <w:t xml:space="preserve">Email Service (Mailtrap):</w:t>
-      </w:r>
-      <w:r>
-        <w:rPr>
-          <w:rFonts w:ascii="Helvetica Neue" w:hAnsi="Helvetica Neue" w:cs="Helvetica Neue"/>
-          <w:sz w:val="32"/>
-          <w:sz-cs w:val="32"/>
-          <w:spacing w:val="0"/>
-        </w:rPr>
-        <w:t xml:space="preserve"> View outgoing test emails at </w:t>
-      </w:r>
-      <w:r>
-        <w:rPr>
-          <w:rFonts w:ascii="Courier" w:hAnsi="Courier" w:cs="Courier"/>
-          <w:sz w:val="28"/>
-          <w:sz-cs w:val="28"/>
-          <w:spacing w:val="0"/>
-        </w:rPr>
-        <w:t xml:space="preserve">https://app-domain.com</w:t>
-      </w:r>
+          <w:sz w:val="34"/>
+          <w:sz-cs w:val="34"/>
+          <w:color w:val="161618"/>
+        </w:rPr>
+        <w:t xml:space="preserve"/>
+        <w:tab/>
+        <w:t xml:space="preserve">•</w:t>
+        <w:tab/>
+        <w:t xml:space="preserve"/>
+      </w:r>
+      <w:r>
+        <w:rPr>
+          <w:rFonts w:ascii="Helvetica Neue" w:hAnsi="Helvetica Neue" w:cs="Helvetica Neue"/>
+          <w:sz w:val="34"/>
+          <w:sz-cs w:val="34"/>
+          <w:spacing w:val="0"/>
+          <w:color w:val="161618"/>
+        </w:rPr>
+        <w:t xml:space="preserve">American Express test cards can only support device regions that are set to the United Kingdom or United States. (Please note: if prompted for OTP, use default value: 111111)</w:t>
+      </w:r>
+    </w:p>
+    <w:p>
+      <w:pPr>
+        <w:ind w:left="720" w:first-line="-720"/>
+      </w:pPr>
+      <w:r>
+        <w:rPr>
+          <w:rFonts w:ascii="Helvetica Neue" w:hAnsi="Helvetica Neue" w:cs="Helvetica Neue"/>
+          <w:sz w:val="34"/>
+          <w:sz-cs w:val="34"/>
+          <w:color w:val="161618"/>
+        </w:rPr>
+        <w:t xml:space="preserve"/>
+        <w:tab/>
+        <w:t xml:space="preserve">•</w:t>
+        <w:tab/>
+        <w:t xml:space="preserve"/>
+      </w:r>
+      <w:r>
+        <w:rPr>
+          <w:rFonts w:ascii="Helvetica Neue" w:hAnsi="Helvetica Neue" w:cs="Helvetica Neue"/>
+          <w:sz w:val="34"/>
+          <w:sz-cs w:val="34"/>
+          <w:spacing w:val="0"/>
+          <w:color w:val="161618"/>
+        </w:rPr>
+        <w:t xml:space="preserve">These are the latest FPANs as of August 2025.</w:t>
+      </w:r>
+    </w:p>
+    <w:p>
+      <w:pPr/>
+      <w:r>
+        <w:rPr>
+          <w:rFonts w:ascii="Helvetica Neue" w:hAnsi="Helvetica Neue" w:cs="Helvetica Neue"/>
+          <w:sz w:val="38"/>
+          <w:sz-cs w:val="38"/>
+          <w:spacing w:val="0"/>
+          <w:color w:val="161618"/>
+        </w:rPr>
+        <w:t xml:space="preserve">American Express</w:t>
+      </w:r>
+    </w:p>
+    <w:p>
+      <w:pPr/>
+      <w:r>
+        <w:rPr>
+          <w:rFonts w:ascii="Helvetica Neue" w:hAnsi="Helvetica Neue" w:cs="Helvetica Neue"/>
+          <w:sz w:val="28"/>
+          <w:sz-cs w:val="28"/>
+          <w:spacing w:val="0"/>
+          <w:color w:val="161618"/>
+        </w:rPr>
+        <w:t xml:space="preserve">United Kingdom</w:t>
+      </w:r>
+    </w:p>
+    <w:p>
+      <w:pPr>
+        <w:ind w:left="720" w:first-line="-720"/>
+        <w:spacing w:after="280"/>
+      </w:pPr>
+      <w:r>
+        <w:rPr>
+          <w:rFonts w:ascii="Helvetica Neue" w:hAnsi="Helvetica Neue" w:cs="Helvetica Neue"/>
+          <w:sz w:val="28"/>
+          <w:sz-cs w:val="28"/>
+          <w:color w:val="161618"/>
+        </w:rPr>
+        <w:t xml:space="preserve"/>
+        <w:tab/>
+        <w:t xml:space="preserve">•</w:t>
+        <w:tab/>
+        <w:t xml:space="preserve"/>
+      </w:r>
+      <w:r>
+        <w:rPr>
+          <w:rFonts w:ascii="Helvetica Neue" w:hAnsi="Helvetica Neue" w:cs="Helvetica Neue"/>
+          <w:sz w:val="28"/>
+          <w:sz-cs w:val="28"/>
+          <w:spacing w:val="0"/>
+          <w:color w:val="161618"/>
+        </w:rPr>
+        <w:t xml:space="preserve">37420 05569 95003</w:t>
+        <w:br/>
+        <w:t xml:space="preserve">Expiration Date: 12/28</w:t>
+        <w:br/>
+        <w:t xml:space="preserve">CID: 1111</w:t>
+      </w:r>
+    </w:p>
+    <w:p>
+      <w:pPr>
+        <w:ind w:left="720" w:first-line="-720"/>
+        <w:spacing w:after="280"/>
+      </w:pPr>
+      <w:r>
+        <w:rPr>
+          <w:rFonts w:ascii="Helvetica Neue" w:hAnsi="Helvetica Neue" w:cs="Helvetica Neue"/>
+          <w:sz w:val="28"/>
+          <w:sz-cs w:val="28"/>
+          <w:color w:val="161618"/>
+        </w:rPr>
+        <w:t xml:space="preserve"/>
+        <w:tab/>
+        <w:t xml:space="preserve">•</w:t>
+        <w:tab/>
+        <w:t xml:space="preserve"/>
+      </w:r>
+      <w:r>
+        <w:rPr>
+          <w:rFonts w:ascii="Helvetica Neue" w:hAnsi="Helvetica Neue" w:cs="Helvetica Neue"/>
+          <w:sz w:val="28"/>
+          <w:sz-cs w:val="28"/>
+          <w:spacing w:val="0"/>
+          <w:color w:val="161618"/>
+        </w:rPr>
+        <w:t xml:space="preserve">37420 05590 81009</w:t>
+        <w:br/>
+        <w:t xml:space="preserve">Expiration Date: 12/28</w:t>
+        <w:br/>
+        <w:t xml:space="preserve">CID: 1111</w:t>
+      </w:r>
+    </w:p>
+    <w:p>
+      <w:pPr>
+        <w:ind w:left="720" w:first-line="-720"/>
+        <w:spacing w:after="280"/>
+      </w:pPr>
+      <w:r>
+        <w:rPr>
+          <w:rFonts w:ascii="Helvetica Neue" w:hAnsi="Helvetica Neue" w:cs="Helvetica Neue"/>
+          <w:sz w:val="28"/>
+          <w:sz-cs w:val="28"/>
+          <w:color w:val="161618"/>
+        </w:rPr>
+        <w:t xml:space="preserve"/>
+        <w:tab/>
+        <w:t xml:space="preserve">•</w:t>
+        <w:tab/>
+        <w:t xml:space="preserve"/>
+      </w:r>
+      <w:r>
+        <w:rPr>
+          <w:rFonts w:ascii="Helvetica Neue" w:hAnsi="Helvetica Neue" w:cs="Helvetica Neue"/>
+          <w:sz w:val="28"/>
+          <w:sz-cs w:val="28"/>
+          <w:spacing w:val="0"/>
+          <w:color w:val="161618"/>
+        </w:rPr>
+        <w:t xml:space="preserve">37420 05605 82003</w:t>
+        <w:br/>
+        <w:t xml:space="preserve">Expiration Date: 12/28</w:t>
+        <w:br/>
+        <w:t xml:space="preserve">CID: 1111</w:t>
+      </w:r>
+    </w:p>
+    <w:p>
+      <w:pPr>
+        <w:ind w:left="720" w:first-line="-720"/>
+        <w:spacing w:after="335"/>
+      </w:pPr>
+      <w:r>
+        <w:rPr>
+          <w:rFonts w:ascii="Helvetica Neue" w:hAnsi="Helvetica Neue" w:cs="Helvetica Neue"/>
+          <w:sz w:val="28"/>
+          <w:sz-cs w:val="28"/>
+          <w:color w:val="161618"/>
+        </w:rPr>
+        <w:t xml:space="preserve"/>
+        <w:tab/>
+        <w:t xml:space="preserve">•</w:t>
+        <w:tab/>
+        <w:t xml:space="preserve"/>
+      </w:r>
+      <w:r>
+        <w:rPr>
+          <w:rFonts w:ascii="Helvetica Neue" w:hAnsi="Helvetica Neue" w:cs="Helvetica Neue"/>
+          <w:sz w:val="28"/>
+          <w:sz-cs w:val="28"/>
+          <w:spacing w:val="0"/>
+          <w:color w:val="161618"/>
+        </w:rPr>
+        <w:t xml:space="preserve">37420 07381 38001</w:t>
+        <w:br/>
+        <w:t xml:space="preserve">Expiration Date: 12/28</w:t>
+        <w:br/>
+        <w:t xml:space="preserve">CID: 7777</w:t>
+      </w:r>
+    </w:p>
+    <w:p>
+      <w:pPr/>
+      <w:r>
+        <w:rPr>
+          <w:rFonts w:ascii="Helvetica Neue" w:hAnsi="Helvetica Neue" w:cs="Helvetica Neue"/>
+          <w:sz w:val="28"/>
+          <w:sz-cs w:val="28"/>
+          <w:spacing w:val="0"/>
+          <w:color w:val="161618"/>
+        </w:rPr>
+        <w:t xml:space="preserve">United States</w:t>
+      </w:r>
+    </w:p>
+    <w:p>
+      <w:pPr>
+        <w:ind w:left="720" w:first-line="-720"/>
+        <w:spacing w:after="280"/>
+      </w:pPr>
+      <w:r>
+        <w:rPr>
+          <w:rFonts w:ascii="Helvetica Neue" w:hAnsi="Helvetica Neue" w:cs="Helvetica Neue"/>
+          <w:sz w:val="28"/>
+          <w:sz-cs w:val="28"/>
+          <w:color w:val="161618"/>
+        </w:rPr>
+        <w:t xml:space="preserve"/>
+        <w:tab/>
+        <w:t xml:space="preserve">•</w:t>
+        <w:tab/>
+        <w:t xml:space="preserve"/>
+      </w:r>
+      <w:r>
+        <w:rPr>
+          <w:rFonts w:ascii="Helvetica Neue" w:hAnsi="Helvetica Neue" w:cs="Helvetica Neue"/>
+          <w:sz w:val="28"/>
+          <w:sz-cs w:val="28"/>
+          <w:spacing w:val="0"/>
+          <w:color w:val="161618"/>
+        </w:rPr>
+        <w:t xml:space="preserve">37273 57230 32000</w:t>
+        <w:br/>
+        <w:t xml:space="preserve">Expiration Date: 12/28</w:t>
+        <w:br/>
+        <w:t xml:space="preserve">CID: 7777</w:t>
+      </w:r>
+    </w:p>
+    <w:p>
+      <w:pPr>
+        <w:ind w:left="720" w:first-line="-720"/>
+        <w:spacing w:after="280"/>
+      </w:pPr>
+      <w:r>
+        <w:rPr>
+          <w:rFonts w:ascii="Helvetica Neue" w:hAnsi="Helvetica Neue" w:cs="Helvetica Neue"/>
+          <w:sz w:val="28"/>
+          <w:sz-cs w:val="28"/>
+          <w:color w:val="161618"/>
+        </w:rPr>
+        <w:t xml:space="preserve"/>
+        <w:tab/>
+        <w:t xml:space="preserve">•</w:t>
+        <w:tab/>
+        <w:t xml:space="preserve"/>
+      </w:r>
+      <w:r>
+        <w:rPr>
+          <w:rFonts w:ascii="Helvetica Neue" w:hAnsi="Helvetica Neue" w:cs="Helvetica Neue"/>
+          <w:sz w:val="28"/>
+          <w:sz-cs w:val="28"/>
+          <w:spacing w:val="0"/>
+          <w:color w:val="161618"/>
+        </w:rPr>
+        <w:t xml:space="preserve">37272 79248 51007</w:t>
+        <w:br/>
+        <w:t xml:space="preserve">Expiration Date: 12/28</w:t>
+        <w:br/>
+        <w:t xml:space="preserve">CID: 1111</w:t>
+      </w:r>
+    </w:p>
+    <w:p>
+      <w:pPr>
+        <w:ind w:left="720" w:first-line="-720"/>
+        <w:spacing w:after="280"/>
+      </w:pPr>
+      <w:r>
+        <w:rPr>
+          <w:rFonts w:ascii="Helvetica Neue" w:hAnsi="Helvetica Neue" w:cs="Helvetica Neue"/>
+          <w:sz w:val="28"/>
+          <w:sz-cs w:val="28"/>
+          <w:color w:val="161618"/>
+        </w:rPr>
+        <w:t xml:space="preserve"/>
+        <w:tab/>
+        <w:t xml:space="preserve">•</w:t>
+        <w:tab/>
+        <w:t xml:space="preserve"/>
+      </w:r>
+      <w:r>
+        <w:rPr>
+          <w:rFonts w:ascii="Helvetica Neue" w:hAnsi="Helvetica Neue" w:cs="Helvetica Neue"/>
+          <w:sz w:val="28"/>
+          <w:sz-cs w:val="28"/>
+          <w:spacing w:val="0"/>
+          <w:color w:val="161618"/>
+        </w:rPr>
+        <w:t xml:space="preserve">37272 67850 11008</w:t>
+        <w:br/>
+        <w:t xml:space="preserve">Expiration Date: 12/28</w:t>
+        <w:br/>
+        <w:t xml:space="preserve">CID: 1111</w:t>
+      </w:r>
+    </w:p>
+    <w:p>
+      <w:pPr>
+        <w:ind w:left="720" w:first-line="-720"/>
+        <w:spacing w:after="280"/>
+      </w:pPr>
+      <w:r>
+        <w:rPr>
+          <w:rFonts w:ascii="Helvetica Neue" w:hAnsi="Helvetica Neue" w:cs="Helvetica Neue"/>
+          <w:sz w:val="28"/>
+          <w:sz-cs w:val="28"/>
+          <w:color w:val="161618"/>
+        </w:rPr>
+        <w:t xml:space="preserve"/>
+        <w:tab/>
+        <w:t xml:space="preserve">•</w:t>
+        <w:tab/>
+        <w:t xml:space="preserve"/>
+      </w:r>
+      <w:r>
+        <w:rPr>
+          <w:rFonts w:ascii="Helvetica Neue" w:hAnsi="Helvetica Neue" w:cs="Helvetica Neue"/>
+          <w:sz w:val="28"/>
+          <w:sz-cs w:val="28"/>
+          <w:spacing w:val="0"/>
+          <w:color w:val="161618"/>
+        </w:rPr>
+        <w:t xml:space="preserve">37677 17299 24003</w:t>
+        <w:br/>
+        <w:t xml:space="preserve">Expiration Date: 12/28</w:t>
+        <w:br/>
+        <w:t xml:space="preserve">CID: 1111</w:t>
+      </w:r>
+    </w:p>
+    <w:p>
+      <w:pPr>
+        <w:ind w:left="720" w:first-line="-720"/>
+        <w:spacing w:after="335"/>
+      </w:pPr>
+      <w:r>
+        <w:rPr>
+          <w:rFonts w:ascii="Helvetica Neue" w:hAnsi="Helvetica Neue" w:cs="Helvetica Neue"/>
+          <w:sz w:val="28"/>
+          <w:sz-cs w:val="28"/>
+          <w:color w:val="161618"/>
+        </w:rPr>
+        <w:t xml:space="preserve"/>
+        <w:tab/>
+        <w:t xml:space="preserve">•</w:t>
+        <w:tab/>
+        <w:t xml:space="preserve"/>
+      </w:r>
+      <w:r>
+        <w:rPr>
+          <w:rFonts w:ascii="Helvetica Neue" w:hAnsi="Helvetica Neue" w:cs="Helvetica Neue"/>
+          <w:sz w:val="28"/>
+          <w:sz-cs w:val="28"/>
+          <w:spacing w:val="0"/>
+          <w:color w:val="161618"/>
+        </w:rPr>
+        <w:t xml:space="preserve">37677 47309 52005</w:t>
+        <w:br/>
+        <w:t xml:space="preserve">Expiration Date: 12/28</w:t>
+        <w:br/>
+        <w:t xml:space="preserve">CID: 1111</w:t>
+      </w:r>
+    </w:p>
+    <w:p>
+      <w:pPr/>
+      <w:r>
+        <w:rPr>
+          <w:rFonts w:ascii="Helvetica Neue" w:hAnsi="Helvetica Neue" w:cs="Helvetica Neue"/>
+          <w:sz w:val="38"/>
+          <w:sz-cs w:val="38"/>
+          <w:spacing w:val="0"/>
+          <w:color w:val="161618"/>
+        </w:rPr>
+        <w:t xml:space="preserve">Discover</w:t>
+      </w:r>
+    </w:p>
+    <w:p>
+      <w:pPr>
+        <w:ind w:left="720" w:first-line="-720"/>
+        <w:spacing w:after="280"/>
+      </w:pPr>
+      <w:r>
+        <w:rPr>
+          <w:rFonts w:ascii="Helvetica Neue" w:hAnsi="Helvetica Neue" w:cs="Helvetica Neue"/>
+          <w:sz w:val="28"/>
+          <w:sz-cs w:val="28"/>
+          <w:color w:val="161618"/>
+        </w:rPr>
+        <w:t xml:space="preserve"/>
+        <w:tab/>
+        <w:t xml:space="preserve">•</w:t>
+        <w:tab/>
+        <w:t xml:space="preserve"/>
+      </w:r>
+      <w:r>
+        <w:rPr>
+          <w:rFonts w:ascii="Helvetica Neue" w:hAnsi="Helvetica Neue" w:cs="Helvetica Neue"/>
+          <w:sz w:val="28"/>
+          <w:sz-cs w:val="28"/>
+          <w:spacing w:val="0"/>
+          <w:color w:val="161618"/>
+        </w:rPr>
+        <w:t xml:space="preserve">FPAN: 6011 0009 9446 2780</w:t>
+        <w:br/>
+        <w:t xml:space="preserve">Expiration Date: 01/30</w:t>
+        <w:br/>
+        <w:t xml:space="preserve">CID: 111</w:t>
+      </w:r>
+    </w:p>
+    <w:p>
+      <w:pPr>
+        <w:ind w:left="720" w:first-line="-720"/>
+        <w:spacing w:after="280"/>
+      </w:pPr>
+      <w:r>
+        <w:rPr>
+          <w:rFonts w:ascii="Helvetica Neue" w:hAnsi="Helvetica Neue" w:cs="Helvetica Neue"/>
+          <w:sz w:val="28"/>
+          <w:sz-cs w:val="28"/>
+          <w:color w:val="161618"/>
+        </w:rPr>
+        <w:t xml:space="preserve"/>
+        <w:tab/>
+        <w:t xml:space="preserve">•</w:t>
+        <w:tab/>
+        <w:t xml:space="preserve"/>
+      </w:r>
+      <w:r>
+        <w:rPr>
+          <w:rFonts w:ascii="Helvetica Neue" w:hAnsi="Helvetica Neue" w:cs="Helvetica Neue"/>
+          <w:sz w:val="28"/>
+          <w:sz-cs w:val="28"/>
+          <w:spacing w:val="0"/>
+          <w:color w:val="161618"/>
+        </w:rPr>
+        <w:t xml:space="preserve">FPAN: 6011 0009 9458 9319</w:t>
+        <w:br/>
+        <w:t xml:space="preserve">Expiration Date: 01/30</w:t>
+        <w:br/>
+        <w:t xml:space="preserve">CID: 111</w:t>
+      </w:r>
+    </w:p>
+    <w:p>
+      <w:pPr>
+        <w:ind w:left="720" w:first-line="-720"/>
+        <w:spacing w:after="280"/>
+      </w:pPr>
+      <w:r>
+        <w:rPr>
+          <w:rFonts w:ascii="Helvetica Neue" w:hAnsi="Helvetica Neue" w:cs="Helvetica Neue"/>
+          <w:sz w:val="28"/>
+          <w:sz-cs w:val="28"/>
+          <w:color w:val="161618"/>
+        </w:rPr>
+        <w:t xml:space="preserve"/>
+        <w:tab/>
+        <w:t xml:space="preserve">•</w:t>
+        <w:tab/>
+        <w:t xml:space="preserve"/>
+      </w:r>
+      <w:r>
+        <w:rPr>
+          <w:rFonts w:ascii="Helvetica Neue" w:hAnsi="Helvetica Neue" w:cs="Helvetica Neue"/>
+          <w:sz w:val="28"/>
+          <w:sz-cs w:val="28"/>
+          <w:spacing w:val="0"/>
+          <w:color w:val="161618"/>
+        </w:rPr>
+        <w:t xml:space="preserve">FPAN: 6011 0009 9475 4889</w:t>
+        <w:br/>
+        <w:t xml:space="preserve">Expiration Date: 01/30</w:t>
+        <w:br/>
+        <w:t xml:space="preserve">CID: 111</w:t>
+      </w:r>
+    </w:p>
+    <w:p>
+      <w:pPr>
+        <w:ind w:left="720" w:first-line="-720"/>
+        <w:spacing w:after="280"/>
+      </w:pPr>
+      <w:r>
+        <w:rPr>
+          <w:rFonts w:ascii="Helvetica Neue" w:hAnsi="Helvetica Neue" w:cs="Helvetica Neue"/>
+          <w:sz w:val="28"/>
+          <w:sz-cs w:val="28"/>
+          <w:color w:val="161618"/>
+        </w:rPr>
+        <w:t xml:space="preserve"/>
+        <w:tab/>
+        <w:t xml:space="preserve">•</w:t>
+        <w:tab/>
+        <w:t xml:space="preserve"/>
+      </w:r>
+      <w:r>
+        <w:rPr>
+          <w:rFonts w:ascii="Helvetica Neue" w:hAnsi="Helvetica Neue" w:cs="Helvetica Neue"/>
+          <w:sz w:val="28"/>
+          <w:sz-cs w:val="28"/>
+          <w:spacing w:val="0"/>
+          <w:color w:val="161618"/>
+        </w:rPr>
+        <w:t xml:space="preserve">FPAN: 6011 0009 9502 9935</w:t>
+        <w:br/>
+        <w:t xml:space="preserve">Expiration Date: 01/30</w:t>
+        <w:br/>
+        <w:t xml:space="preserve">CID: 111</w:t>
+      </w:r>
+    </w:p>
+    <w:p>
+      <w:pPr>
+        <w:ind w:left="720" w:first-line="-720"/>
+        <w:spacing w:after="280"/>
+      </w:pPr>
+      <w:r>
+        <w:rPr>
+          <w:rFonts w:ascii="Helvetica Neue" w:hAnsi="Helvetica Neue" w:cs="Helvetica Neue"/>
+          <w:sz w:val="28"/>
+          <w:sz-cs w:val="28"/>
+          <w:color w:val="161618"/>
+        </w:rPr>
+        <w:t xml:space="preserve"/>
+        <w:tab/>
+        <w:t xml:space="preserve">•</w:t>
+        <w:tab/>
+        <w:t xml:space="preserve"/>
+      </w:r>
+      <w:r>
+        <w:rPr>
+          <w:rFonts w:ascii="Helvetica Neue" w:hAnsi="Helvetica Neue" w:cs="Helvetica Neue"/>
+          <w:sz w:val="28"/>
+          <w:sz-cs w:val="28"/>
+          <w:spacing w:val="0"/>
+          <w:color w:val="161618"/>
+        </w:rPr>
+        <w:t xml:space="preserve">FPAN: 6011 0009 9548 9295</w:t>
+        <w:br/>
+        <w:t xml:space="preserve">Expiration Date: 01/30</w:t>
+        <w:br/>
+        <w:t xml:space="preserve">CID: 111</w:t>
+      </w:r>
+    </w:p>
+    <w:p>
+      <w:pPr>
+        <w:ind w:left="720" w:first-line="-720"/>
+        <w:spacing w:after="280"/>
+      </w:pPr>
+      <w:r>
+        <w:rPr>
+          <w:rFonts w:ascii="Helvetica Neue" w:hAnsi="Helvetica Neue" w:cs="Helvetica Neue"/>
+          <w:sz w:val="28"/>
+          <w:sz-cs w:val="28"/>
+          <w:color w:val="161618"/>
+        </w:rPr>
+        <w:t xml:space="preserve"/>
+        <w:tab/>
+        <w:t xml:space="preserve">•</w:t>
+        <w:tab/>
+        <w:t xml:space="preserve"/>
+      </w:r>
+      <w:r>
+        <w:rPr>
+          <w:rFonts w:ascii="Helvetica Neue" w:hAnsi="Helvetica Neue" w:cs="Helvetica Neue"/>
+          <w:sz w:val="28"/>
+          <w:sz-cs w:val="28"/>
+          <w:spacing w:val="0"/>
+          <w:color w:val="161618"/>
+        </w:rPr>
+        <w:t xml:space="preserve">FPAN: 6011 0009 9551 2914</w:t>
+        <w:br/>
+        <w:t xml:space="preserve">Expiration Date: 01/30</w:t>
+        <w:br/>
+        <w:t xml:space="preserve">CID: 111</w:t>
+      </w:r>
+    </w:p>
+    <w:p>
+      <w:pPr>
+        <w:ind w:left="720" w:first-line="-720"/>
+        <w:spacing w:after="280"/>
+      </w:pPr>
+      <w:r>
+        <w:rPr>
+          <w:rFonts w:ascii="Helvetica Neue" w:hAnsi="Helvetica Neue" w:cs="Helvetica Neue"/>
+          <w:sz w:val="28"/>
+          <w:sz-cs w:val="28"/>
+          <w:color w:val="161618"/>
+        </w:rPr>
+        <w:t xml:space="preserve"/>
+        <w:tab/>
+        <w:t xml:space="preserve">•</w:t>
+        <w:tab/>
+        <w:t xml:space="preserve"/>
+      </w:r>
+      <w:r>
+        <w:rPr>
+          <w:rFonts w:ascii="Helvetica Neue" w:hAnsi="Helvetica Neue" w:cs="Helvetica Neue"/>
+          <w:sz w:val="28"/>
+          <w:sz-cs w:val="28"/>
+          <w:spacing w:val="0"/>
+          <w:color w:val="161618"/>
+        </w:rPr>
+        <w:t xml:space="preserve">FPAN: 6011 0009 9556 1499</w:t>
+        <w:br/>
+        <w:t xml:space="preserve">Expiration Date: 01/30</w:t>
+        <w:br/>
+        <w:t xml:space="preserve">CID: 111</w:t>
+      </w:r>
+    </w:p>
+    <w:p>
+      <w:pPr>
+        <w:ind w:left="720" w:first-line="-720"/>
+        <w:spacing w:after="280"/>
+      </w:pPr>
+      <w:r>
+        <w:rPr>
+          <w:rFonts w:ascii="Helvetica Neue" w:hAnsi="Helvetica Neue" w:cs="Helvetica Neue"/>
+          <w:sz w:val="28"/>
+          <w:sz-cs w:val="28"/>
+          <w:color w:val="161618"/>
+        </w:rPr>
+        <w:t xml:space="preserve"/>
+        <w:tab/>
+        <w:t xml:space="preserve">•</w:t>
+        <w:tab/>
+        <w:t xml:space="preserve"/>
+      </w:r>
+      <w:r>
+        <w:rPr>
+          <w:rFonts w:ascii="Helvetica Neue" w:hAnsi="Helvetica Neue" w:cs="Helvetica Neue"/>
+          <w:sz w:val="28"/>
+          <w:sz-cs w:val="28"/>
+          <w:spacing w:val="0"/>
+          <w:color w:val="161618"/>
+        </w:rPr>
+        <w:t xml:space="preserve">FPAN: 6011 0009 9557 7610</w:t>
+        <w:br/>
+        <w:t xml:space="preserve">Expiration Date: 01/30</w:t>
+        <w:br/>
+        <w:t xml:space="preserve">CID: 111</w:t>
+      </w:r>
+    </w:p>
+    <w:p>
+      <w:pPr>
+        <w:ind w:left="720" w:first-line="-720"/>
+        <w:spacing w:after="280"/>
+      </w:pPr>
+      <w:r>
+        <w:rPr>
+          <w:rFonts w:ascii="Helvetica Neue" w:hAnsi="Helvetica Neue" w:cs="Helvetica Neue"/>
+          <w:sz w:val="28"/>
+          <w:sz-cs w:val="28"/>
+          <w:color w:val="161618"/>
+        </w:rPr>
+        <w:t xml:space="preserve"/>
+        <w:tab/>
+        <w:t xml:space="preserve">•</w:t>
+        <w:tab/>
+        <w:t xml:space="preserve"/>
+      </w:r>
+      <w:r>
+        <w:rPr>
+          <w:rFonts w:ascii="Helvetica Neue" w:hAnsi="Helvetica Neue" w:cs="Helvetica Neue"/>
+          <w:sz w:val="28"/>
+          <w:sz-cs w:val="28"/>
+          <w:spacing w:val="0"/>
+          <w:color w:val="161618"/>
+        </w:rPr>
+        <w:t xml:space="preserve">FPAN: 6011 0009 9606 5037</w:t>
+        <w:br/>
+        <w:t xml:space="preserve">Expiration Date: 01/30</w:t>
+        <w:br/>
+        <w:t xml:space="preserve">CID: 111</w:t>
+      </w:r>
+    </w:p>
+    <w:p>
+      <w:pPr>
+        <w:ind w:left="720" w:first-line="-720"/>
+        <w:spacing w:after="335"/>
+      </w:pPr>
+      <w:r>
+        <w:rPr>
+          <w:rFonts w:ascii="Helvetica Neue" w:hAnsi="Helvetica Neue" w:cs="Helvetica Neue"/>
+          <w:sz w:val="28"/>
+          <w:sz-cs w:val="28"/>
+          <w:color w:val="161618"/>
+        </w:rPr>
+        <w:t xml:space="preserve"/>
+        <w:tab/>
+        <w:t xml:space="preserve">•</w:t>
+        <w:tab/>
+        <w:t xml:space="preserve"/>
+      </w:r>
+      <w:r>
+        <w:rPr>
+          <w:rFonts w:ascii="Helvetica Neue" w:hAnsi="Helvetica Neue" w:cs="Helvetica Neue"/>
+          <w:sz w:val="28"/>
+          <w:sz-cs w:val="28"/>
+          <w:spacing w:val="0"/>
+          <w:color w:val="161618"/>
+        </w:rPr>
+        <w:t xml:space="preserve">FPAN: 6011 0009 9631 8741</w:t>
+        <w:br/>
+        <w:t xml:space="preserve">Expiration Date: 01/30</w:t>
+        <w:br/>
+        <w:t xml:space="preserve">CID: 111</w:t>
+      </w:r>
+    </w:p>
+    <w:p>
+      <w:pPr/>
+      <w:r>
+        <w:rPr>
+          <w:rFonts w:ascii="Helvetica Neue" w:hAnsi="Helvetica Neue" w:cs="Helvetica Neue"/>
+          <w:sz w:val="38"/>
+          <w:sz-cs w:val="38"/>
+          <w:spacing w:val="0"/>
+          <w:color w:val="161618"/>
+        </w:rPr>
+        <w:t xml:space="preserve">JCB</w:t>
+      </w:r>
+    </w:p>
+    <w:p>
+      <w:pPr>
+        <w:ind w:left="720" w:first-line="-720"/>
+        <w:spacing w:after="280"/>
+      </w:pPr>
+      <w:r>
+        <w:rPr>
+          <w:rFonts w:ascii="Helvetica Neue" w:hAnsi="Helvetica Neue" w:cs="Helvetica Neue"/>
+          <w:sz w:val="28"/>
+          <w:sz-cs w:val="28"/>
+          <w:color w:val="161618"/>
+        </w:rPr>
+        <w:t xml:space="preserve"/>
+        <w:tab/>
+        <w:t xml:space="preserve">•</w:t>
+        <w:tab/>
+        <w:t xml:space="preserve"/>
+      </w:r>
+      <w:r>
+        <w:rPr>
+          <w:rFonts w:ascii="Helvetica Neue" w:hAnsi="Helvetica Neue" w:cs="Helvetica Neue"/>
+          <w:sz w:val="28"/>
+          <w:sz-cs w:val="28"/>
+          <w:spacing w:val="0"/>
+          <w:color w:val="161618"/>
+        </w:rPr>
+        <w:t xml:space="preserve">3540 5019 9000 9324</w:t>
+        <w:br/>
+        <w:t xml:space="preserve">Expiration Date: 01/30</w:t>
+        <w:br/>
+        <w:t xml:space="preserve">CVV: 111</w:t>
+      </w:r>
+    </w:p>
+    <w:p>
+      <w:pPr>
+        <w:ind w:left="720" w:first-line="-720"/>
+        <w:spacing w:after="280"/>
+      </w:pPr>
+      <w:r>
+        <w:rPr>
+          <w:rFonts w:ascii="Helvetica Neue" w:hAnsi="Helvetica Neue" w:cs="Helvetica Neue"/>
+          <w:sz w:val="28"/>
+          <w:sz-cs w:val="28"/>
+          <w:color w:val="161618"/>
+        </w:rPr>
+        <w:t xml:space="preserve"/>
+        <w:tab/>
+        <w:t xml:space="preserve">•</w:t>
+        <w:tab/>
+        <w:t xml:space="preserve"/>
+      </w:r>
+      <w:r>
+        <w:rPr>
+          <w:rFonts w:ascii="Helvetica Neue" w:hAnsi="Helvetica Neue" w:cs="Helvetica Neue"/>
+          <w:sz w:val="28"/>
+          <w:sz-cs w:val="28"/>
+          <w:spacing w:val="0"/>
+          <w:color w:val="161618"/>
+        </w:rPr>
+        <w:t xml:space="preserve">3540 5019 9000 9381</w:t>
+        <w:br/>
+        <w:t xml:space="preserve">Expiration Date: 01/30</w:t>
+        <w:br/>
+        <w:t xml:space="preserve">CVV: 111</w:t>
+      </w:r>
+    </w:p>
+    <w:p>
+      <w:pPr>
+        <w:ind w:left="720" w:first-line="-720"/>
+        <w:spacing w:after="280"/>
+      </w:pPr>
+      <w:r>
+        <w:rPr>
+          <w:rFonts w:ascii="Helvetica Neue" w:hAnsi="Helvetica Neue" w:cs="Helvetica Neue"/>
+          <w:sz w:val="28"/>
+          <w:sz-cs w:val="28"/>
+          <w:color w:val="161618"/>
+        </w:rPr>
+        <w:t xml:space="preserve"/>
+        <w:tab/>
+        <w:t xml:space="preserve">•</w:t>
+        <w:tab/>
+        <w:t xml:space="preserve"/>
+      </w:r>
+      <w:r>
+        <w:rPr>
+          <w:rFonts w:ascii="Helvetica Neue" w:hAnsi="Helvetica Neue" w:cs="Helvetica Neue"/>
+          <w:sz w:val="28"/>
+          <w:sz-cs w:val="28"/>
+          <w:spacing w:val="0"/>
+          <w:color w:val="161618"/>
+        </w:rPr>
+        <w:t xml:space="preserve">3540 5019 9000 9373</w:t>
+        <w:br/>
+        <w:t xml:space="preserve">Expiration Date: 01/30</w:t>
+        <w:br/>
+        <w:t xml:space="preserve">CVV: 111</w:t>
+      </w:r>
+    </w:p>
+    <w:p>
+      <w:pPr>
+        <w:ind w:left="720" w:first-line="-720"/>
+        <w:spacing w:after="280"/>
+      </w:pPr>
+      <w:r>
+        <w:rPr>
+          <w:rFonts w:ascii="Helvetica Neue" w:hAnsi="Helvetica Neue" w:cs="Helvetica Neue"/>
+          <w:sz w:val="28"/>
+          <w:sz-cs w:val="28"/>
+          <w:color w:val="161618"/>
+        </w:rPr>
+        <w:t xml:space="preserve"/>
+        <w:tab/>
+        <w:t xml:space="preserve">•</w:t>
+        <w:tab/>
+        <w:t xml:space="preserve"/>
+      </w:r>
+      <w:r>
+        <w:rPr>
+          <w:rFonts w:ascii="Helvetica Neue" w:hAnsi="Helvetica Neue" w:cs="Helvetica Neue"/>
+          <w:sz w:val="28"/>
+          <w:sz-cs w:val="28"/>
+          <w:spacing w:val="0"/>
+          <w:color w:val="161618"/>
+        </w:rPr>
+        <w:t xml:space="preserve">3540 5019 9000 9415</w:t>
+        <w:br/>
+        <w:t xml:space="preserve">Expiration Date: 01/30</w:t>
+        <w:br/>
+        <w:t xml:space="preserve">CVV: 111</w:t>
+      </w:r>
+    </w:p>
+    <w:p>
+      <w:pPr>
+        <w:ind w:left="720" w:first-line="-720"/>
+        <w:spacing w:after="280"/>
+      </w:pPr>
+      <w:r>
+        <w:rPr>
+          <w:rFonts w:ascii="Helvetica Neue" w:hAnsi="Helvetica Neue" w:cs="Helvetica Neue"/>
+          <w:sz w:val="28"/>
+          <w:sz-cs w:val="28"/>
+          <w:color w:val="161618"/>
+        </w:rPr>
+        <w:t xml:space="preserve"/>
+        <w:tab/>
+        <w:t xml:space="preserve">•</w:t>
+        <w:tab/>
+        <w:t xml:space="preserve"/>
+      </w:r>
+      <w:r>
+        <w:rPr>
+          <w:rFonts w:ascii="Helvetica Neue" w:hAnsi="Helvetica Neue" w:cs="Helvetica Neue"/>
+          <w:sz w:val="28"/>
+          <w:sz-cs w:val="28"/>
+          <w:spacing w:val="0"/>
+          <w:color w:val="161618"/>
+        </w:rPr>
+        <w:t xml:space="preserve">3540 5019 9000 9423</w:t>
+        <w:br/>
+        <w:t xml:space="preserve">Expiration Date: 01/30</w:t>
+        <w:br/>
+        <w:t xml:space="preserve">CVV: 111</w:t>
+      </w:r>
+    </w:p>
+    <w:p>
+      <w:pPr>
+        <w:ind w:left="720" w:first-line="-720"/>
+        <w:spacing w:after="280"/>
+      </w:pPr>
+      <w:r>
+        <w:rPr>
+          <w:rFonts w:ascii="Helvetica Neue" w:hAnsi="Helvetica Neue" w:cs="Helvetica Neue"/>
+          <w:sz w:val="28"/>
+          <w:sz-cs w:val="28"/>
+          <w:color w:val="161618"/>
+        </w:rPr>
+        <w:t xml:space="preserve"/>
+        <w:tab/>
+        <w:t xml:space="preserve">•</w:t>
+        <w:tab/>
+        <w:t xml:space="preserve"/>
+      </w:r>
+      <w:r>
+        <w:rPr>
+          <w:rFonts w:ascii="Helvetica Neue" w:hAnsi="Helvetica Neue" w:cs="Helvetica Neue"/>
+          <w:sz w:val="28"/>
+          <w:sz-cs w:val="28"/>
+          <w:spacing w:val="0"/>
+          <w:color w:val="161618"/>
+        </w:rPr>
+        <w:t xml:space="preserve">3540 5019 9000 9431</w:t>
+        <w:br/>
+        <w:t xml:space="preserve">Expiration Date: 01/30</w:t>
+        <w:br/>
+        <w:t xml:space="preserve">CVV: 111</w:t>
+      </w:r>
+    </w:p>
+    <w:p>
+      <w:pPr>
+        <w:ind w:left="720" w:first-line="-720"/>
+        <w:spacing w:after="280"/>
+      </w:pPr>
+      <w:r>
+        <w:rPr>
+          <w:rFonts w:ascii="Helvetica Neue" w:hAnsi="Helvetica Neue" w:cs="Helvetica Neue"/>
+          <w:sz w:val="28"/>
+          <w:sz-cs w:val="28"/>
+          <w:color w:val="161618"/>
+        </w:rPr>
+        <w:t xml:space="preserve"/>
+        <w:tab/>
+        <w:t xml:space="preserve">•</w:t>
+        <w:tab/>
+        <w:t xml:space="preserve"/>
+      </w:r>
+      <w:r>
+        <w:rPr>
+          <w:rFonts w:ascii="Helvetica Neue" w:hAnsi="Helvetica Neue" w:cs="Helvetica Neue"/>
+          <w:sz w:val="28"/>
+          <w:sz-cs w:val="28"/>
+          <w:spacing w:val="0"/>
+          <w:color w:val="161618"/>
+        </w:rPr>
+        <w:t xml:space="preserve">3540 5019 9000 9449</w:t>
+        <w:br/>
+        <w:t xml:space="preserve">Expiration Date: 01/30</w:t>
+        <w:br/>
+        <w:t xml:space="preserve">CVV: 111</w:t>
+      </w:r>
+    </w:p>
+    <w:p>
+      <w:pPr>
+        <w:ind w:left="720" w:first-line="-720"/>
+        <w:spacing w:after="280"/>
+      </w:pPr>
+      <w:r>
+        <w:rPr>
+          <w:rFonts w:ascii="Helvetica Neue" w:hAnsi="Helvetica Neue" w:cs="Helvetica Neue"/>
+          <w:sz w:val="28"/>
+          <w:sz-cs w:val="28"/>
+          <w:color w:val="161618"/>
+        </w:rPr>
+        <w:t xml:space="preserve"/>
+        <w:tab/>
+        <w:t xml:space="preserve">•</w:t>
+        <w:tab/>
+        <w:t xml:space="preserve"/>
+      </w:r>
+      <w:r>
+        <w:rPr>
+          <w:rFonts w:ascii="Helvetica Neue" w:hAnsi="Helvetica Neue" w:cs="Helvetica Neue"/>
+          <w:sz w:val="28"/>
+          <w:sz-cs w:val="28"/>
+          <w:spacing w:val="0"/>
+          <w:color w:val="161618"/>
+        </w:rPr>
+        <w:t xml:space="preserve">3540 5019 9000 9456</w:t>
+        <w:br/>
+        <w:t xml:space="preserve">Expiration Date: 01/30</w:t>
+        <w:br/>
+        <w:t xml:space="preserve">CVV: 111</w:t>
+      </w:r>
+    </w:p>
+    <w:p>
+      <w:pPr>
+        <w:ind w:left="720" w:first-line="-720"/>
+        <w:spacing w:after="280"/>
+      </w:pPr>
+      <w:r>
+        <w:rPr>
+          <w:rFonts w:ascii="Helvetica Neue" w:hAnsi="Helvetica Neue" w:cs="Helvetica Neue"/>
+          <w:sz w:val="28"/>
+          <w:sz-cs w:val="28"/>
+          <w:color w:val="161618"/>
+        </w:rPr>
+        <w:t xml:space="preserve"/>
+        <w:tab/>
+        <w:t xml:space="preserve">•</w:t>
+        <w:tab/>
+        <w:t xml:space="preserve"/>
+      </w:r>
+      <w:r>
+        <w:rPr>
+          <w:rFonts w:ascii="Helvetica Neue" w:hAnsi="Helvetica Neue" w:cs="Helvetica Neue"/>
+          <w:sz w:val="28"/>
+          <w:sz-cs w:val="28"/>
+          <w:spacing w:val="0"/>
+          <w:color w:val="161618"/>
+        </w:rPr>
+        <w:t xml:space="preserve">3540 5019 9111 1111</w:t>
+        <w:br/>
+        <w:t xml:space="preserve">Expiration Date: 01/30</w:t>
+        <w:br/>
+        <w:t xml:space="preserve">CVV: 111</w:t>
+      </w:r>
+    </w:p>
+    <w:p>
+      <w:pPr>
+        <w:ind w:left="720" w:first-line="-720"/>
+        <w:spacing w:after="335"/>
+      </w:pPr>
+      <w:r>
+        <w:rPr>
+          <w:rFonts w:ascii="Helvetica Neue" w:hAnsi="Helvetica Neue" w:cs="Helvetica Neue"/>
+          <w:sz w:val="28"/>
+          <w:sz-cs w:val="28"/>
+          <w:color w:val="161618"/>
+        </w:rPr>
+        <w:t xml:space="preserve"/>
+        <w:tab/>
+        <w:t xml:space="preserve">•</w:t>
+        <w:tab/>
+        <w:t xml:space="preserve"/>
+      </w:r>
+      <w:r>
+        <w:rPr>
+          <w:rFonts w:ascii="Helvetica Neue" w:hAnsi="Helvetica Neue" w:cs="Helvetica Neue"/>
+          <w:sz w:val="28"/>
+          <w:sz-cs w:val="28"/>
+          <w:spacing w:val="0"/>
+          <w:color w:val="161618"/>
+        </w:rPr>
+        <w:t xml:space="preserve">3540 5019 9111 1202</w:t>
+        <w:br/>
+        <w:t xml:space="preserve">Expiration Date: 01/30</w:t>
+        <w:br/>
+        <w:t xml:space="preserve">CVV: 111</w:t>
+      </w:r>
+    </w:p>
+    <w:p>
+      <w:pPr/>
+      <w:r>
+        <w:rPr>
+          <w:rFonts w:ascii="Helvetica Neue" w:hAnsi="Helvetica Neue" w:cs="Helvetica Neue"/>
+          <w:sz w:val="38"/>
+          <w:sz-cs w:val="38"/>
+          <w:spacing w:val="0"/>
+          <w:color w:val="161618"/>
+        </w:rPr>
+        <w:t xml:space="preserve">Mastercard</w:t>
+      </w:r>
+    </w:p>
+    <w:p>
+      <w:pPr>
+        <w:ind w:left="720" w:first-line="-720"/>
+        <w:spacing w:after="280"/>
+      </w:pPr>
+      <w:r>
+        <w:rPr>
+          <w:rFonts w:ascii="Helvetica Neue" w:hAnsi="Helvetica Neue" w:cs="Helvetica Neue"/>
+          <w:sz w:val="28"/>
+          <w:sz-cs w:val="28"/>
+          <w:color w:val="161618"/>
+        </w:rPr>
+        <w:t xml:space="preserve"/>
+        <w:tab/>
+        <w:t xml:space="preserve">•</w:t>
+        <w:tab/>
+        <w:t xml:space="preserve"/>
+      </w:r>
+      <w:r>
+        <w:rPr>
+          <w:rFonts w:ascii="Helvetica Neue" w:hAnsi="Helvetica Neue" w:cs="Helvetica Neue"/>
+          <w:sz w:val="28"/>
+          <w:sz-cs w:val="28"/>
+          <w:spacing w:val="0"/>
+          <w:color w:val="161618"/>
+        </w:rPr>
+        <w:t xml:space="preserve">5204 2452 5046 0049</w:t>
+        <w:br/>
+        <w:t xml:space="preserve">Expiration Date: 01/30</w:t>
+        <w:br/>
+        <w:t xml:space="preserve">CVC: 111</w:t>
+      </w:r>
+    </w:p>
+    <w:p>
+      <w:pPr>
+        <w:ind w:left="720" w:first-line="-720"/>
+        <w:spacing w:after="280"/>
+      </w:pPr>
+      <w:r>
+        <w:rPr>
+          <w:rFonts w:ascii="Helvetica Neue" w:hAnsi="Helvetica Neue" w:cs="Helvetica Neue"/>
+          <w:sz w:val="28"/>
+          <w:sz-cs w:val="28"/>
+          <w:color w:val="161618"/>
+        </w:rPr>
+        <w:t xml:space="preserve"/>
+        <w:tab/>
+        <w:t xml:space="preserve">•</w:t>
+        <w:tab/>
+        <w:t xml:space="preserve"/>
+      </w:r>
+      <w:r>
+        <w:rPr>
+          <w:rFonts w:ascii="Helvetica Neue" w:hAnsi="Helvetica Neue" w:cs="Helvetica Neue"/>
+          <w:sz w:val="28"/>
+          <w:sz-cs w:val="28"/>
+          <w:spacing w:val="0"/>
+          <w:color w:val="161618"/>
+        </w:rPr>
+        <w:t xml:space="preserve">5204 2452 5052 2095</w:t>
+        <w:br/>
+        <w:t xml:space="preserve">Expiration Date: 01/30</w:t>
+        <w:br/>
+        <w:t xml:space="preserve">CVC: 111</w:t>
+      </w:r>
+    </w:p>
+    <w:p>
+      <w:pPr>
+        <w:ind w:left="720" w:first-line="-720"/>
+        <w:spacing w:after="280"/>
+      </w:pPr>
+      <w:r>
+        <w:rPr>
+          <w:rFonts w:ascii="Helvetica Neue" w:hAnsi="Helvetica Neue" w:cs="Helvetica Neue"/>
+          <w:sz w:val="28"/>
+          <w:sz-cs w:val="28"/>
+          <w:color w:val="161618"/>
+        </w:rPr>
+        <w:t xml:space="preserve"/>
+        <w:tab/>
+        <w:t xml:space="preserve">•</w:t>
+        <w:tab/>
+        <w:t xml:space="preserve"/>
+      </w:r>
+      <w:r>
+        <w:rPr>
+          <w:rFonts w:ascii="Helvetica Neue" w:hAnsi="Helvetica Neue" w:cs="Helvetica Neue"/>
+          <w:sz w:val="28"/>
+          <w:sz-cs w:val="28"/>
+          <w:spacing w:val="0"/>
+          <w:color w:val="161618"/>
+        </w:rPr>
+        <w:t xml:space="preserve">5204 2452 5110 7599</w:t>
+        <w:br/>
+        <w:t xml:space="preserve">Expiration Date: 01/30</w:t>
+        <w:br/>
+        <w:t xml:space="preserve">CVC: 111</w:t>
+      </w:r>
+    </w:p>
+    <w:p>
+      <w:pPr>
+        <w:ind w:left="720" w:first-line="-720"/>
+        <w:spacing w:after="280"/>
+      </w:pPr>
+      <w:r>
+        <w:rPr>
+          <w:rFonts w:ascii="Helvetica Neue" w:hAnsi="Helvetica Neue" w:cs="Helvetica Neue"/>
+          <w:sz w:val="28"/>
+          <w:sz-cs w:val="28"/>
+          <w:color w:val="161618"/>
+        </w:rPr>
+        <w:t xml:space="preserve"/>
+        <w:tab/>
+        <w:t xml:space="preserve">•</w:t>
+        <w:tab/>
+        <w:t xml:space="preserve"/>
+      </w:r>
+      <w:r>
+        <w:rPr>
+          <w:rFonts w:ascii="Helvetica Neue" w:hAnsi="Helvetica Neue" w:cs="Helvetica Neue"/>
+          <w:sz w:val="28"/>
+          <w:sz-cs w:val="28"/>
+          <w:spacing w:val="0"/>
+          <w:color w:val="161618"/>
+        </w:rPr>
+        <w:t xml:space="preserve">5204 2452 5305 0839</w:t>
+        <w:br/>
+        <w:t xml:space="preserve">Expiration Date: 01/30</w:t>
+        <w:br/>
+        <w:t xml:space="preserve">CVC: 111</w:t>
+      </w:r>
+    </w:p>
+    <w:p>
+      <w:pPr>
+        <w:ind w:left="720" w:first-line="-720"/>
+        <w:spacing w:after="335"/>
+      </w:pPr>
+      <w:r>
+        <w:rPr>
+          <w:rFonts w:ascii="Helvetica Neue" w:hAnsi="Helvetica Neue" w:cs="Helvetica Neue"/>
+          <w:sz w:val="28"/>
+          <w:sz-cs w:val="28"/>
+          <w:color w:val="161618"/>
+        </w:rPr>
+        <w:t xml:space="preserve"/>
+        <w:tab/>
+        <w:t xml:space="preserve">•</w:t>
+        <w:tab/>
+        <w:t xml:space="preserve"/>
+      </w:r>
+      <w:r>
+        <w:rPr>
+          <w:rFonts w:ascii="Helvetica Neue" w:hAnsi="Helvetica Neue" w:cs="Helvetica Neue"/>
+          <w:sz w:val="28"/>
+          <w:sz-cs w:val="28"/>
+          <w:spacing w:val="0"/>
+          <w:color w:val="161618"/>
+        </w:rPr>
+        <w:t xml:space="preserve">5204 2452 5471 8095</w:t>
+        <w:br/>
+        <w:t xml:space="preserve">Expiration Date: 01/30</w:t>
+        <w:br/>
+        <w:t xml:space="preserve">CVC: 111</w:t>
+      </w:r>
+    </w:p>
+    <w:p>
+      <w:pPr/>
+      <w:r>
+        <w:rPr>
+          <w:rFonts w:ascii="Helvetica Neue" w:hAnsi="Helvetica Neue" w:cs="Helvetica Neue"/>
+          <w:sz w:val="38"/>
+          <w:sz-cs w:val="38"/>
+          <w:spacing w:val="0"/>
+          <w:color w:val="161618"/>
+        </w:rPr>
+        <w:t xml:space="preserve">Visa</w:t>
+      </w:r>
+    </w:p>
+    <w:p>
+      <w:pPr>
+        <w:ind w:left="720" w:first-line="-720"/>
+        <w:spacing w:after="280"/>
+      </w:pPr>
+      <w:r>
+        <w:rPr>
+          <w:rFonts w:ascii="Helvetica Neue" w:hAnsi="Helvetica Neue" w:cs="Helvetica Neue"/>
+          <w:sz w:val="28"/>
+          <w:sz-cs w:val="28"/>
+          <w:color w:val="161618"/>
+        </w:rPr>
+        <w:t xml:space="preserve"/>
+        <w:tab/>
+        <w:t xml:space="preserve">•</w:t>
+        <w:tab/>
+        <w:t xml:space="preserve"/>
+      </w:r>
+      <w:r>
+        <w:rPr>
+          <w:rFonts w:ascii="Helvetica Neue" w:hAnsi="Helvetica Neue" w:cs="Helvetica Neue"/>
+          <w:sz w:val="28"/>
+          <w:sz-cs w:val="28"/>
+          <w:spacing w:val="0"/>
+          <w:color w:val="161618"/>
+        </w:rPr>
+        <w:t xml:space="preserve">4622 9431 2318 9285</w:t>
+        <w:br/>
+        <w:t xml:space="preserve">Expiration Date: 12/2028</w:t>
+        <w:br/>
+        <w:t xml:space="preserve">CVV: 096</w:t>
+      </w:r>
+    </w:p>
+    <w:p>
+      <w:pPr>
+        <w:ind w:left="720" w:first-line="-720"/>
+        <w:spacing w:after="280"/>
+      </w:pPr>
+      <w:r>
+        <w:rPr>
+          <w:rFonts w:ascii="Helvetica Neue" w:hAnsi="Helvetica Neue" w:cs="Helvetica Neue"/>
+          <w:sz w:val="28"/>
+          <w:sz-cs w:val="28"/>
+          <w:color w:val="161618"/>
+        </w:rPr>
+        <w:t xml:space="preserve"/>
+        <w:tab/>
+        <w:t xml:space="preserve">•</w:t>
+        <w:tab/>
+        <w:t xml:space="preserve"/>
+      </w:r>
+      <w:r>
+        <w:rPr>
+          <w:rFonts w:ascii="Helvetica Neue" w:hAnsi="Helvetica Neue" w:cs="Helvetica Neue"/>
+          <w:sz w:val="28"/>
+          <w:sz-cs w:val="28"/>
+          <w:spacing w:val="0"/>
+          <w:color w:val="161618"/>
+        </w:rPr>
+        <w:t xml:space="preserve">4622 9431 2318 9293</w:t>
+        <w:br/>
+        <w:t xml:space="preserve">Expiration Date: 12/2028</w:t>
+        <w:br/>
+        <w:t xml:space="preserve">CVV: 413</w:t>
+      </w:r>
+    </w:p>
+    <w:p>
+      <w:pPr>
+        <w:ind w:left="720" w:first-line="-720"/>
+        <w:spacing w:after="280"/>
+      </w:pPr>
+      <w:r>
+        <w:rPr>
+          <w:rFonts w:ascii="Helvetica Neue" w:hAnsi="Helvetica Neue" w:cs="Helvetica Neue"/>
+          <w:sz w:val="28"/>
+          <w:sz-cs w:val="28"/>
+          <w:color w:val="161618"/>
+        </w:rPr>
+        <w:t xml:space="preserve"/>
+        <w:tab/>
+        <w:t xml:space="preserve">•</w:t>
+        <w:tab/>
+        <w:t xml:space="preserve"/>
+      </w:r>
+      <w:r>
+        <w:rPr>
+          <w:rFonts w:ascii="Helvetica Neue" w:hAnsi="Helvetica Neue" w:cs="Helvetica Neue"/>
+          <w:sz w:val="28"/>
+          <w:sz-cs w:val="28"/>
+          <w:spacing w:val="0"/>
+          <w:color w:val="161618"/>
+        </w:rPr>
+        <w:t xml:space="preserve">4622 9431 2318 9301</w:t>
+        <w:br/>
+        <w:t xml:space="preserve">Expiration Date: 12/2028</w:t>
+        <w:br/>
+        <w:t xml:space="preserve">CVV: 752</w:t>
+      </w:r>
+    </w:p>
+    <w:p>
+      <w:pPr>
+        <w:ind w:left="720" w:first-line="-720"/>
+        <w:spacing w:after="280"/>
+      </w:pPr>
+      <w:r>
+        <w:rPr>
+          <w:rFonts w:ascii="Helvetica Neue" w:hAnsi="Helvetica Neue" w:cs="Helvetica Neue"/>
+          <w:sz w:val="28"/>
+          <w:sz-cs w:val="28"/>
+          <w:color w:val="161618"/>
+        </w:rPr>
+        <w:t xml:space="preserve"/>
+        <w:tab/>
+        <w:t xml:space="preserve">•</w:t>
+        <w:tab/>
+        <w:t xml:space="preserve"/>
+      </w:r>
+      <w:r>
+        <w:rPr>
+          <w:rFonts w:ascii="Helvetica Neue" w:hAnsi="Helvetica Neue" w:cs="Helvetica Neue"/>
+          <w:sz w:val="28"/>
+          <w:sz-cs w:val="28"/>
+          <w:spacing w:val="0"/>
+          <w:color w:val="161618"/>
+        </w:rPr>
+        <w:t xml:space="preserve">4622 9431 2318 9319</w:t>
+        <w:br/>
+        <w:t xml:space="preserve">Expiration Date: 12/2028</w:t>
+        <w:br/>
+        <w:t xml:space="preserve">CVV: 356</w:t>
+      </w:r>
+    </w:p>
+    <w:p>
+      <w:pPr>
+        <w:ind w:left="720" w:first-line="-720"/>
+        <w:spacing w:after="280"/>
+      </w:pPr>
+      <w:r>
+        <w:rPr>
+          <w:rFonts w:ascii="Helvetica Neue" w:hAnsi="Helvetica Neue" w:cs="Helvetica Neue"/>
+          <w:sz w:val="28"/>
+          <w:sz-cs w:val="28"/>
+          <w:color w:val="161618"/>
+        </w:rPr>
+        <w:t xml:space="preserve"/>
+        <w:tab/>
+        <w:t xml:space="preserve">•</w:t>
+        <w:tab/>
+        <w:t xml:space="preserve"/>
+      </w:r>
+      <w:r>
+        <w:rPr>
+          <w:rFonts w:ascii="Helvetica Neue" w:hAnsi="Helvetica Neue" w:cs="Helvetica Neue"/>
+          <w:sz w:val="28"/>
+          <w:sz-cs w:val="28"/>
+          <w:spacing w:val="0"/>
+          <w:color w:val="161618"/>
+        </w:rPr>
+        <w:t xml:space="preserve">4622 9431 2318 9327</w:t>
+        <w:br/>
+        <w:t xml:space="preserve">Expiration Date: 12/2028</w:t>
+        <w:br/>
+        <w:t xml:space="preserve">CVV: 994</w:t>
+      </w:r>
+    </w:p>
+    <w:p>
+      <w:pPr>
+        <w:ind w:left="720" w:first-line="-720"/>
+        <w:spacing w:after="280"/>
+      </w:pPr>
+      <w:r>
+        <w:rPr>
+          <w:rFonts w:ascii="Helvetica Neue" w:hAnsi="Helvetica Neue" w:cs="Helvetica Neue"/>
+          <w:sz w:val="28"/>
+          <w:sz-cs w:val="28"/>
+          <w:color w:val="161618"/>
+        </w:rPr>
+        <w:t xml:space="preserve"/>
+        <w:tab/>
+        <w:t xml:space="preserve">•</w:t>
+        <w:tab/>
+        <w:t xml:space="preserve"/>
+      </w:r>
+      <w:r>
+        <w:rPr>
+          <w:rFonts w:ascii="Helvetica Neue" w:hAnsi="Helvetica Neue" w:cs="Helvetica Neue"/>
+          <w:sz w:val="28"/>
+          <w:sz-cs w:val="28"/>
+          <w:spacing w:val="0"/>
+          <w:color w:val="161618"/>
+        </w:rPr>
+        <w:t xml:space="preserve">4622 9431 2318 9335</w:t>
+        <w:br/>
+        <w:t xml:space="preserve">Expiration Date: 12/2028</w:t>
+        <w:br/>
+        <w:t xml:space="preserve">CVV: 777</w:t>
+      </w:r>
+    </w:p>
+    <w:p>
+      <w:pPr>
+        <w:ind w:left="720" w:first-line="-720"/>
+        <w:spacing w:after="280"/>
+      </w:pPr>
+      <w:r>
+        <w:rPr>
+          <w:rFonts w:ascii="Helvetica Neue" w:hAnsi="Helvetica Neue" w:cs="Helvetica Neue"/>
+          <w:sz w:val="28"/>
+          <w:sz-cs w:val="28"/>
+          <w:color w:val="161618"/>
+        </w:rPr>
+        <w:t xml:space="preserve"/>
+        <w:tab/>
+        <w:t xml:space="preserve">•</w:t>
+        <w:tab/>
+        <w:t xml:space="preserve"/>
+      </w:r>
+      <w:r>
+        <w:rPr>
+          <w:rFonts w:ascii="Helvetica Neue" w:hAnsi="Helvetica Neue" w:cs="Helvetica Neue"/>
+          <w:sz w:val="28"/>
+          <w:sz-cs w:val="28"/>
+          <w:spacing w:val="0"/>
+          <w:color w:val="161618"/>
+        </w:rPr>
+        <w:t xml:space="preserve">4622 9431 2318 9343</w:t>
+        <w:br/>
+        <w:t xml:space="preserve">Expiration Date: 12/2028</w:t>
+        <w:br/>
+        <w:t xml:space="preserve">CVV: 868</w:t>
+      </w:r>
+    </w:p>
+    <w:p>
+      <w:pPr>
+        <w:ind w:left="720" w:first-line="-720"/>
+        <w:spacing w:after="280"/>
+      </w:pPr>
+      <w:r>
+        <w:rPr>
+          <w:rFonts w:ascii="Helvetica Neue" w:hAnsi="Helvetica Neue" w:cs="Helvetica Neue"/>
+          <w:sz w:val="28"/>
+          <w:sz-cs w:val="28"/>
+          <w:color w:val="161618"/>
+        </w:rPr>
+        <w:t xml:space="preserve"/>
+        <w:tab/>
+        <w:t xml:space="preserve">•</w:t>
+        <w:tab/>
+        <w:t xml:space="preserve"/>
+      </w:r>
+      <w:r>
+        <w:rPr>
+          <w:rFonts w:ascii="Helvetica Neue" w:hAnsi="Helvetica Neue" w:cs="Helvetica Neue"/>
+          <w:sz w:val="28"/>
+          <w:sz-cs w:val="28"/>
+          <w:spacing w:val="0"/>
+          <w:color w:val="161618"/>
+        </w:rPr>
+        <w:t xml:space="preserve">4622 9431 2318 9350</w:t>
+        <w:br/>
+        <w:t xml:space="preserve">Expiration Date: 12/2028</w:t>
+        <w:br/>
+        <w:t xml:space="preserve">CVV: 792</w:t>
+      </w:r>
+    </w:p>
+    <w:p>
+      <w:pPr>
+        <w:ind w:left="720" w:first-line="-720"/>
+        <w:spacing w:after="280"/>
+      </w:pPr>
+      <w:r>
+        <w:rPr>
+          <w:rFonts w:ascii="Helvetica Neue" w:hAnsi="Helvetica Neue" w:cs="Helvetica Neue"/>
+          <w:sz w:val="28"/>
+          <w:sz-cs w:val="28"/>
+          <w:color w:val="161618"/>
+        </w:rPr>
+        <w:t xml:space="preserve"/>
+        <w:tab/>
+        <w:t xml:space="preserve">•</w:t>
+        <w:tab/>
+        <w:t xml:space="preserve"/>
+      </w:r>
+      <w:r>
+        <w:rPr>
+          <w:rFonts w:ascii="Helvetica Neue" w:hAnsi="Helvetica Neue" w:cs="Helvetica Neue"/>
+          <w:sz w:val="28"/>
+          <w:sz-cs w:val="28"/>
+          <w:spacing w:val="0"/>
+          <w:color w:val="161618"/>
+        </w:rPr>
+        <w:t xml:space="preserve">4622 9431 2318 9368</w:t>
+        <w:br/>
+        <w:t xml:space="preserve">Expiration Date: 12/2028</w:t>
+        <w:br/>
+        <w:t xml:space="preserve">CVV: 161</w:t>
+      </w:r>
+    </w:p>
+    <w:p>
+      <w:pPr>
+        <w:ind w:left="720" w:first-line="-720"/>
+        <w:spacing w:after="335"/>
+      </w:pPr>
+      <w:r>
+        <w:rPr>
+          <w:rFonts w:ascii="Helvetica Neue" w:hAnsi="Helvetica Neue" w:cs="Helvetica Neue"/>
+          <w:sz w:val="28"/>
+          <w:sz-cs w:val="28"/>
+          <w:color w:val="161618"/>
+        </w:rPr>
+        <w:t xml:space="preserve"/>
+        <w:tab/>
+        <w:t xml:space="preserve">•</w:t>
+        <w:tab/>
+        <w:t xml:space="preserve"/>
+      </w:r>
+      <w:r>
+        <w:rPr>
+          <w:rFonts w:ascii="Helvetica Neue" w:hAnsi="Helvetica Neue" w:cs="Helvetica Neue"/>
+          <w:sz w:val="28"/>
+          <w:sz-cs w:val="28"/>
+          <w:spacing w:val="0"/>
+          <w:color w:val="161618"/>
+        </w:rPr>
+        <w:t xml:space="preserve">4622 9431 2318 9376</w:t>
+        <w:br/>
+        <w:t xml:space="preserve">Expiration Date: 12/2028</w:t>
+        <w:br/>
+        <w:t xml:space="preserve">CVV: 732</w:t>
+      </w:r>
+    </w:p>
+    <w:p>
+      <w:pPr>
+        <w:spacing w:after="335"/>
+      </w:pPr>
       <w:r>
         <w:rPr>
           <w:rFonts w:ascii="Helvetica Neue" w:hAnsi="Helvetica Neue" w:cs="Helvetica Neue"/>

</xml_diff>